<commit_message>
feat(board-resolution): firm's 2026-09 template, both proposed names, one bullet per director
The parent board resolution (pre-2), which is the NOC for a foreign
subsidiary, now renders from the firm's updated Word file:

- both Part A proposed names are printed ("A and B"),
- each Part A director is its own bullet with Mr. / Ms. from their gender,
  so the list grows with the number of directors instead of two fixed slots,
- the signatory block follows the firm's layout (no parent address line).

scripts/prepare-board-resolution-docx.mjs rebuilds the tagged template from
the firm's file by its Word comments, keeping layout, fonts and numbering, and
strips the comments and the yellow fill-in highlights. It also drops the stray
")" the old template printed after the authorised capital.

Co-Authored-By: Claude Opus 5.5 <noreply@anthropic.com>
</commit_message>
<xml_diff>
--- a/public/templates/boardResolution.docx
+++ b/public/templates/boardResolution.docx
@@ -65,67 +65,27 @@
           <w:sz w:val="22"/>
           <w:szCs w:val="22"/>
         </w:rPr>
-        <w:t>{PARENT_ENTITY_NAME}</w:t>
-      </w:r>
-      <w:r>
-        <w:rPr>
-          <w:rFonts w:ascii="Times New Roman" w:hAnsi="Times New Roman" w:cs="Times New Roman"/>
-          <w:b/>
-          <w:bCs/>
-          <w:sz w:val="22"/>
-          <w:szCs w:val="22"/>
-        </w:rPr>
-        <w:t xml:space="preserve"> ("THE COMPANY"), SUCH RESOLUTIONS, EFFECTIVE AS OF </w:t>
-      </w:r>
-      <w:r>
-        <w:rPr>
-          <w:rFonts w:ascii="Times New Roman" w:hAnsi="Times New Roman" w:cs="Times New Roman"/>
-          <w:b/>
-          <w:bCs/>
-          <w:sz w:val="22"/>
-          <w:szCs w:val="22"/>
-        </w:rPr>
-        <w:t>{RESOLUTION_EFFECTIVE_DATE}</w:t>
-      </w:r>
-      <w:r>
-        <w:rPr>
-          <w:rFonts w:ascii="Times New Roman" w:hAnsi="Times New Roman" w:cs="Times New Roman"/>
-          <w:b/>
-          <w:bCs/>
-          <w:sz w:val="22"/>
-          <w:szCs w:val="22"/>
-        </w:rPr>
-        <w:t xml:space="preserve"/>
-      </w:r>
-      <w:r>
-        <w:rPr>
-          <w:rFonts w:ascii="Times New Roman" w:hAnsi="Times New Roman" w:cs="Times New Roman"/>
-          <w:b/>
-          <w:bCs/>
-          <w:sz w:val="22"/>
-          <w:szCs w:val="22"/>
-        </w:rPr>
-        <w:t/>
-      </w:r>
-      <w:r>
-        <w:rPr>
-          <w:rFonts w:ascii="Times New Roman" w:hAnsi="Times New Roman" w:cs="Times New Roman"/>
-          <w:b/>
-          <w:bCs/>
-          <w:sz w:val="22"/>
-          <w:szCs w:val="22"/>
-        </w:rPr>
-        <w:t/>
-      </w:r>
-      <w:r>
-        <w:rPr>
-          <w:rFonts w:ascii="Times New Roman" w:hAnsi="Times New Roman" w:cs="Times New Roman"/>
-          <w:b/>
-          <w:bCs/>
-          <w:sz w:val="22"/>
-          <w:szCs w:val="22"/>
-        </w:rPr>
-        <w:t>.</w:t>
+        <w:t xml:space="preserve">{PARENT_ENTITY_NAME} </w:t>
+      </w:r>
+      <w:r>
+        <w:rPr>
+          <w:rFonts w:ascii="Times New Roman" w:hAnsi="Times New Roman" w:cs="Times New Roman"/>
+          <w:b/>
+          <w:bCs/>
+          <w:sz w:val="22"/>
+          <w:szCs w:val="22"/>
+        </w:rPr>
+        <w:t xml:space="preserve">("THE COMPANY"), SUCH RESOLUTIONS, EFFECTIVE AS OF </w:t>
+      </w:r>
+      <w:r>
+        <w:rPr>
+          <w:rFonts w:ascii="Times New Roman" w:hAnsi="Times New Roman" w:cs="Times New Roman"/>
+          <w:b/>
+          <w:bCs/>
+          <w:sz w:val="22"/>
+          <w:szCs w:val="22"/>
+        </w:rPr>
+        <w:t xml:space="preserve">{RESOLUTION_EFFECTIVE_DATE}</w:t>
       </w:r>
     </w:p>
     <w:p>
@@ -153,15 +113,15 @@
           <w:sz w:val="22"/>
           <w:szCs w:val="22"/>
         </w:rPr>
-        <w:t xml:space="preserve"> in accordance with the applicable provisions of the laws of {PARENT_JURISDICTION}{#PARENT_STATE}, the State of </w:t>
-      </w:r>
-      <w:r>
-        <w:rPr>
-          <w:rFonts w:ascii="Times New Roman" w:hAnsi="Times New Roman" w:cs="Times New Roman"/>
-          <w:sz w:val="22"/>
-          <w:szCs w:val="22"/>
-        </w:rPr>
-        <w:t>{PARENT_STATE}{/PARENT_STATE}</w:t>
+        <w:t xml:space="preserve"> in accordance with the applicable provisions of the laws of </w:t>
+      </w:r>
+      <w:r>
+        <w:rPr>
+          <w:rFonts w:ascii="Times New Roman" w:hAnsi="Times New Roman" w:cs="Times New Roman"/>
+          <w:sz w:val="22"/>
+          <w:szCs w:val="22"/>
+        </w:rPr>
+        <w:t xml:space="preserve">{PARENT_JURISDICTION}{#PARENT_STATE}, the State of {PARENT_STATE}{/PARENT_STATE}</w:t>
       </w:r>
       <w:r>
         <w:rPr>
@@ -171,26 +131,59 @@
         </w:rPr>
         <w:t xml:space="preserve">, and the governing documents of </w:t>
       </w:r>
-      <w:bookmarkStart w:id="0" w:name="_Hlk218090763"/>
-      <w:r>
-        <w:rPr>
-          <w:rFonts w:ascii="Times New Roman" w:hAnsi="Times New Roman" w:cs="Times New Roman"/>
-          <w:b/>
-          <w:bCs/>
-          <w:sz w:val="22"/>
-          <w:szCs w:val="22"/>
-        </w:rPr>
-        <w:t>{PARENT_ENTITY_NAME}</w:t>
-      </w:r>
-      <w:r>
-        <w:rPr>
-          <w:rFonts w:ascii="Times New Roman" w:hAnsi="Times New Roman" w:cs="Times New Roman"/>
-          <w:b/>
-          <w:bCs/>
-          <w:sz w:val="22"/>
-          <w:szCs w:val="22"/>
-        </w:rPr>
-        <w:t/>
+      <w:r>
+        <w:rPr>
+          <w:rFonts w:ascii="Times New Roman" w:hAnsi="Times New Roman" w:cs="Times New Roman"/>
+          <w:b/>
+          <w:bCs/>
+          <w:sz w:val="22"/>
+          <w:szCs w:val="22"/>
+        </w:rPr>
+        <w:t xml:space="preserve">{PARENT_ENTITY_NAME}</w:t>
+      </w:r>
+      <w:r>
+        <w:rPr>
+          <w:rFonts w:ascii="Times New Roman" w:hAnsi="Times New Roman" w:cs="Times New Roman"/>
+          <w:sz w:val="22"/>
+          <w:szCs w:val="22"/>
+        </w:rPr>
+        <w:t xml:space="preserve">(hereinafter referred to as the "Company"), consent of the Board of Directors be and is hereby accorded to incorporate a wholly owned subsidiary of the Company in </w:t>
+      </w:r>
+      <w:r>
+        <w:rPr>
+          <w:rFonts w:ascii="Times New Roman" w:hAnsi="Times New Roman" w:cs="Times New Roman"/>
+          <w:b/>
+          <w:bCs/>
+          <w:sz w:val="22"/>
+          <w:szCs w:val="22"/>
+        </w:rPr>
+        <w:t>India</w:t>
+      </w:r>
+      <w:r>
+        <w:rPr>
+          <w:rFonts w:ascii="Times New Roman" w:hAnsi="Times New Roman" w:cs="Times New Roman"/>
+          <w:sz w:val="22"/>
+          <w:szCs w:val="22"/>
+        </w:rPr>
+        <w:t xml:space="preserve"> in the name and style </w:t>
+      </w:r>
+      <w:r>
+        <w:rPr>
+          <w:rFonts w:ascii="Times New Roman" w:hAnsi="Times New Roman" w:cs="Times New Roman"/>
+          <w:sz w:val="22"/>
+          <w:szCs w:val="22"/>
+        </w:rPr>
+        <w:t xml:space="preserve">of </w:t>
+      </w:r>
+      <w:r>
+        <w:rPr>
+          <w:rFonts w:ascii="Times New Roman" w:hAnsi="Times New Roman" w:cs="Times New Roman"/>
+          <w:b/>
+          <w:bCs/>
+          <w:sz w:val="22"/>
+          <w:szCs w:val="22"/>
+        </w:rPr>
+        <w:t xml:space="preserve">{PROPOSED_NAMES}</w:t>
       </w:r>
       <w:r>
         <w:rPr>
@@ -210,64 +203,7 @@
           <w:sz w:val="22"/>
           <w:szCs w:val="22"/>
         </w:rPr>
-        <w:t/>
-      </w:r>
-      <w:bookmarkEnd w:id="0"/>
-      <w:r>
-        <w:rPr>
-          <w:rFonts w:ascii="Times New Roman" w:hAnsi="Times New Roman" w:cs="Times New Roman"/>
-          <w:sz w:val="22"/>
-          <w:szCs w:val="22"/>
-        </w:rPr>
-        <w:t xml:space="preserve">(hereinafter referred to as the "Company"), consent of the Board of Directors be and is hereby accorded to incorporate a wholly owned subsidiary of the Company in </w:t>
-      </w:r>
-      <w:r>
-        <w:rPr>
-          <w:rFonts w:ascii="Times New Roman" w:hAnsi="Times New Roman" w:cs="Times New Roman"/>
-          <w:b/>
-          <w:bCs/>
-          <w:sz w:val="22"/>
-          <w:szCs w:val="22"/>
-        </w:rPr>
-        <w:t>India</w:t>
-      </w:r>
-      <w:r>
-        <w:rPr>
-          <w:rFonts w:ascii="Times New Roman" w:hAnsi="Times New Roman" w:cs="Times New Roman"/>
-          <w:sz w:val="22"/>
-          <w:szCs w:val="22"/>
-        </w:rPr>
-        <w:t xml:space="preserve"> in the name and style of </w:t>
-      </w:r>
-      <w:r>
-        <w:rPr>
-          <w:rFonts w:ascii="Times New Roman" w:hAnsi="Times New Roman" w:cs="Times New Roman"/>
-          <w:b/>
-          <w:bCs/>
-          <w:sz w:val="22"/>
-          <w:szCs w:val="22"/>
-        </w:rPr>
-        <w:t>{PROPOSED_NAME_1}</w:t>
-      </w:r>
-      <w:r>
-        <w:rPr>
-          <w:rFonts w:ascii="Times New Roman" w:hAnsi="Times New Roman" w:cs="Times New Roman"/>
-          <w:b/>
-          <w:bCs/>
-          <w:sz w:val="22"/>
-          <w:szCs w:val="22"/>
-        </w:rPr>
         <w:t xml:space="preserve"/>
-      </w:r>
-      <w:r>
-        <w:rPr>
-          <w:rFonts w:ascii="Times New Roman" w:hAnsi="Times New Roman" w:cs="Times New Roman"/>
-          <w:b/>
-          <w:bCs/>
-          <w:sz w:val="22"/>
-          <w:szCs w:val="22"/>
-        </w:rPr>
-        <w:t/>
       </w:r>
       <w:r>
         <w:rPr>
@@ -334,7 +270,50 @@
         <w:t xml:space="preserve"> as per the National Industrial Classification (NIC) codes:</w:t>
       </w:r>
       <w:r>
-        <w:t xml:space="preserve"> {NIC_CODES}</w:t>
+        <w:rPr>
+          <w:rFonts w:ascii="Times New Roman" w:hAnsi="Times New Roman" w:cs="Times New Roman"/>
+          <w:b/>
+          <w:bCs/>
+          <w:sz w:val="22"/>
+          <w:szCs w:val="22"/>
+        </w:rPr>
+        <w:t xml:space="preserve"> </w:t>
+      </w:r>
+      <w:r>
+        <w:rPr>
+          <w:rFonts w:ascii="Times New Roman" w:hAnsi="Times New Roman" w:cs="Times New Roman"/>
+          <w:b/>
+          <w:bCs/>
+          <w:sz w:val="22"/>
+          <w:szCs w:val="22"/>
+        </w:rPr>
+        <w:t xml:space="preserve">{NIC_CODES}</w:t>
+      </w:r>
+      <w:r>
+        <w:rPr>
+          <w:rFonts w:ascii="Times New Roman" w:hAnsi="Times New Roman" w:cs="Times New Roman"/>
+          <w:sz w:val="22"/>
+          <w:szCs w:val="22"/>
+        </w:rPr>
+        <w:t xml:space="preserve"/>
+      </w:r>
+      <w:r>
+        <w:rPr>
+          <w:rFonts w:ascii="Times New Roman" w:hAnsi="Times New Roman" w:cs="Times New Roman"/>
+          <w:sz w:val="22"/>
+          <w:szCs w:val="22"/>
+        </w:rPr>
+        <w:t xml:space="preserve"/>
+      </w:r>
+      <w:r>
+        <w:rPr>
+          <w:rFonts w:ascii="Times New Roman" w:hAnsi="Times New Roman" w:cs="Times New Roman"/>
+          <w:b/>
+          <w:bCs/>
+          <w:sz w:val="22"/>
+          <w:szCs w:val="22"/>
+        </w:rPr>
+        <w:t xml:space="preserve"/>
       </w:r>
     </w:p>
     <w:p>
@@ -390,7 +369,25 @@
           <w:sz w:val="22"/>
           <w:szCs w:val="22"/>
         </w:rPr>
-        <w:t>INR {AUTHORISED_CAPITAL}</w:t>
+        <w:t xml:space="preserve">INR </w:t>
+      </w:r>
+      <w:r>
+        <w:rPr>
+          <w:rFonts w:ascii="Times New Roman" w:hAnsi="Times New Roman" w:cs="Times New Roman"/>
+          <w:b/>
+          <w:bCs/>
+          <w:sz w:val="22"/>
+          <w:szCs w:val="22"/>
+        </w:rPr>
+        <w:t xml:space="preserve">{AUTHORISED_CAPITAL}</w:t>
+      </w:r>
+      <w:r>
+        <w:rPr>
+          <w:rFonts w:ascii="Times New Roman" w:hAnsi="Times New Roman" w:cs="Times New Roman"/>
+          <w:sz w:val="22"/>
+          <w:szCs w:val="22"/>
+        </w:rPr>
+        <w:t xml:space="preserve"> </w:t>
       </w:r>
       <w:r>
         <w:rPr>
@@ -400,23 +397,13 @@
         </w:rPr>
         <w:t xml:space="preserve"/>
       </w:r>
-      <w:proofErr w:type="gramStart"/>
-      <w:r>
-        <w:rPr>
-          <w:rFonts w:ascii="Times New Roman" w:hAnsi="Times New Roman" w:cs="Times New Roman"/>
-          <w:sz w:val="22"/>
-          <w:szCs w:val="22"/>
-        </w:rPr>
-        <w:t>) ,</w:t>
-      </w:r>
-      <w:proofErr w:type="gramEnd"/>
-      <w:r>
-        <w:rPr>
-          <w:rFonts w:ascii="Times New Roman" w:hAnsi="Times New Roman" w:cs="Times New Roman"/>
-          <w:sz w:val="22"/>
-          <w:szCs w:val="22"/>
-        </w:rPr>
-        <w:t xml:space="preserve"> and the initial </w:t>
+      <w:r>
+        <w:rPr>
+          <w:rFonts w:ascii="Times New Roman" w:hAnsi="Times New Roman" w:cs="Times New Roman"/>
+          <w:sz w:val="22"/>
+          <w:szCs w:val="22"/>
+        </w:rPr>
+        <w:t xml:space="preserve"> , and the initial </w:t>
       </w:r>
       <w:r>
         <w:rPr>
@@ -434,17 +421,41 @@
           <w:sz w:val="22"/>
           <w:szCs w:val="22"/>
         </w:rPr>
-        <w:t xml:space="preserve"> shall also be </w:t>
-      </w:r>
-      <w:r>
-        <w:rPr>
-          <w:rFonts w:ascii="Times New Roman" w:hAnsi="Times New Roman" w:cs="Times New Roman"/>
-          <w:b/>
-          <w:bCs/>
-          <w:sz w:val="22"/>
-          <w:szCs w:val="22"/>
-        </w:rPr>
-        <w:t>INR {PAID_UP_CAPITAL}</w:t>
+        <w:t xml:space="preserve"> shall also </w:t>
+      </w:r>
+      <w:r>
+        <w:rPr>
+          <w:rFonts w:ascii="Times New Roman" w:hAnsi="Times New Roman" w:cs="Times New Roman"/>
+          <w:sz w:val="22"/>
+          <w:szCs w:val="22"/>
+        </w:rPr>
+        <w:t>be</w:t>
+      </w:r>
+      <w:r>
+        <w:rPr>
+          <w:rFonts w:ascii="Times New Roman" w:hAnsi="Times New Roman" w:cs="Times New Roman"/>
+          <w:sz w:val="22"/>
+          <w:szCs w:val="22"/>
+        </w:rPr>
+        <w:t xml:space="preserve"> </w:t>
+      </w:r>
+      <w:r>
+        <w:rPr>
+          <w:rFonts w:ascii="Times New Roman" w:hAnsi="Times New Roman" w:cs="Times New Roman"/>
+          <w:b/>
+          <w:bCs/>
+          <w:sz w:val="22"/>
+          <w:szCs w:val="22"/>
+        </w:rPr>
+        <w:t xml:space="preserve">INR {PAID_UP_CAPITAL}</w:t>
+      </w:r>
+      <w:r>
+        <w:rPr>
+          <w:rFonts w:ascii="Times New Roman" w:hAnsi="Times New Roman" w:cs="Times New Roman"/>
+          <w:sz w:val="22"/>
+          <w:szCs w:val="22"/>
+        </w:rPr>
+        <w:t/>
       </w:r>
       <w:r>
         <w:rPr>
@@ -454,7 +465,6 @@
         </w:rPr>
         <w:t xml:space="preserve">, to be subscribed in full by </w:t>
       </w:r>
-      <w:proofErr w:type="gramStart"/>
       <w:r>
         <w:rPr>
           <w:rFonts w:ascii="Times New Roman" w:hAnsi="Times New Roman" w:cs="Times New Roman"/>
@@ -465,20 +475,10 @@
         </w:rPr>
         <w:t xml:space="preserve">{PARENT_ENTITY_NAME}</w:t>
       </w:r>
-      <w:r>
-        <w:rPr>
-          <w:rFonts w:ascii="Times New Roman" w:hAnsi="Times New Roman" w:cs="Times New Roman"/>
-          <w:b/>
-          <w:bCs/>
-          <w:sz w:val="22"/>
-          <w:szCs w:val="22"/>
-        </w:rPr>
-        <w:t/>
-      </w:r>
-      <w:proofErr w:type="gramEnd"/>
     </w:p>
     <w:p>
       <w:pPr>
+        <w:jc w:val="both"/>
         <w:rPr>
           <w:rFonts w:ascii="Times New Roman" w:hAnsi="Times New Roman" w:cs="Times New Roman"/>
           <w:sz w:val="22"/>
@@ -503,77 +503,97 @@
         </w:rPr>
         <w:t xml:space="preserve">. </w:t>
       </w:r>
-      <w:r>
-        <w:rPr>
-          <w:rFonts w:ascii="Times New Roman" w:hAnsi="Times New Roman" w:cs="Times New Roman"/>
-          <w:sz w:val="22"/>
-          <w:szCs w:val="22"/>
-        </w:rPr>
-        <w:t>M</w:t>
-      </w:r>
-      <w:r>
-        <w:rPr>
-          <w:rFonts w:ascii="Times New Roman" w:hAnsi="Times New Roman" w:cs="Times New Roman"/>
-          <w:sz w:val="22"/>
-          <w:szCs w:val="22"/>
-        </w:rPr>
-        <w:t>r</w:t>
-      </w:r>
-      <w:r>
-        <w:rPr>
-          <w:rFonts w:ascii="Times New Roman" w:hAnsi="Times New Roman" w:cs="Times New Roman"/>
-          <w:sz w:val="22"/>
-          <w:szCs w:val="22"/>
-        </w:rPr>
-        <w:t>/Ms</w:t>
-      </w:r>
-      <w:r>
-        <w:rPr>
-          <w:rFonts w:ascii="Times New Roman" w:hAnsi="Times New Roman" w:cs="Times New Roman"/>
-          <w:sz w:val="22"/>
-          <w:szCs w:val="22"/>
-        </w:rPr>
-        <w:t xml:space="preserve">. </w:t>
-      </w:r>
-      <w:r>
-        <w:rPr>
-          <w:rFonts w:ascii="Times New Roman" w:hAnsi="Times New Roman" w:cs="Times New Roman"/>
-          <w:sz w:val="22"/>
-          <w:szCs w:val="22"/>
-        </w:rPr>
-        <w:t xml:space="preserve">{INDIAN_DIRECTOR_LINE} </w:t>
-      </w:r>
-      <w:r>
-        <w:rPr>
-          <w:rFonts w:ascii="Times New Roman" w:hAnsi="Times New Roman" w:cs="Times New Roman"/>
-          <w:sz w:val="22"/>
-          <w:szCs w:val="22"/>
-        </w:rPr>
-        <w:t xml:space="preserve">and </w:t>
-      </w:r>
-      <w:r>
-        <w:rPr>
-          <w:rFonts w:ascii="Times New Roman" w:hAnsi="Times New Roman" w:cs="Times New Roman"/>
-          <w:sz w:val="22"/>
-          <w:szCs w:val="22"/>
-        </w:rPr>
-        <w:t xml:space="preserve">Mr. </w:t>
-      </w:r>
-      <w:r>
-        <w:rPr>
-          <w:rFonts w:ascii="Times New Roman" w:hAnsi="Times New Roman" w:cs="Times New Roman"/>
-          <w:sz w:val="22"/>
-          <w:szCs w:val="22"/>
-        </w:rPr>
-        <w:t>{SECOND_DIRECTOR_LINE}</w:t>
-      </w:r>
-      <w:r>
-        <w:rPr>
-          <w:rFonts w:ascii="Times New Roman" w:hAnsi="Times New Roman" w:cs="Times New Roman"/>
-          <w:sz w:val="22"/>
-          <w:szCs w:val="22"/>
-        </w:rPr>
-        <w:t>, be and each hereby is authorized to take all necessary steps for the incorporation of the Indian subsidiary including but not limited t</w:t>
+    </w:p>
+    <w:p>
+      <w:r>
+        <w:t>{#DIRECTORS}</w:t>
+      </w:r>
+    </w:p>
+    <w:p>
+      <w:pPr>
+        <w:pStyle w:val="ListParagraph"/>
+        <w:numPr>
+          <w:ilvl w:val="0"/>
+          <w:numId w:val="4"/>
+        </w:numPr>
+        <w:tabs>
+          <w:tab w:val="clear" w:pos="2160"/>
+          <w:tab w:val="num" w:pos="1843"/>
+        </w:tabs>
+        <w:ind w:left="709" w:hanging="142"/>
+        <w:jc w:val="both"/>
+        <w:rPr>
+          <w:rFonts w:ascii="Times New Roman" w:hAnsi="Times New Roman" w:cs="Times New Roman"/>
+          <w:sz w:val="22"/>
+          <w:szCs w:val="22"/>
+        </w:rPr>
+      </w:pPr>
+      <w:r>
+        <w:rPr>
+          <w:rFonts w:ascii="Times New Roman" w:hAnsi="Times New Roman" w:cs="Times New Roman"/>
+          <w:sz w:val="22"/>
+          <w:szCs w:val="22"/>
+        </w:rPr>
+        <w:t xml:space="preserve">{NAME}</w:t>
+      </w:r>
+      <w:r>
+        <w:rPr>
+          <w:rFonts w:ascii="Times New Roman" w:hAnsi="Times New Roman" w:cs="Times New Roman"/>
+          <w:sz w:val="22"/>
+          <w:szCs w:val="22"/>
+        </w:rPr>
+        <w:t xml:space="preserve"/>
+      </w:r>
+      <w:r>
+        <w:rPr>
+          <w:rFonts w:ascii="Times New Roman" w:hAnsi="Times New Roman" w:cs="Times New Roman"/>
+          <w:sz w:val="22"/>
+          <w:szCs w:val="22"/>
+        </w:rPr>
+        <w:t xml:space="preserve"/>
+      </w:r>
+      <w:r>
+        <w:rPr>
+          <w:rFonts w:ascii="Times New Roman" w:hAnsi="Times New Roman" w:cs="Times New Roman"/>
+          <w:sz w:val="22"/>
+          <w:szCs w:val="22"/>
+        </w:rPr>
+        <w:t xml:space="preserve"/>
+      </w:r>
+    </w:p>
+    <w:p>
+      <w:r>
+        <w:t>{/DIRECTORS}</w:t>
+      </w:r>
+    </w:p>
+    <w:p>
+      <w:pPr>
+        <w:pStyle w:val="ListParagraph"/>
+        <w:ind w:left="2160"/>
+        <w:jc w:val="both"/>
+        <w:rPr>
+          <w:rFonts w:ascii="Times New Roman" w:hAnsi="Times New Roman" w:cs="Times New Roman"/>
+          <w:sz w:val="22"/>
+          <w:szCs w:val="22"/>
+        </w:rPr>
+      </w:pPr>
+    </w:p>
+    <w:p>
+      <w:pPr>
+        <w:jc w:val="both"/>
+        <w:rPr>
+          <w:rFonts w:ascii="Times New Roman" w:hAnsi="Times New Roman" w:cs="Times New Roman"/>
+          <w:sz w:val="22"/>
+          <w:szCs w:val="22"/>
+        </w:rPr>
+      </w:pPr>
+      <w:r>
+        <w:rPr>
+          <w:rFonts w:ascii="Times New Roman" w:hAnsi="Times New Roman" w:cs="Times New Roman"/>
+          <w:sz w:val="22"/>
+          <w:szCs w:val="22"/>
+        </w:rPr>
+        <w:t>be and each hereby is authorized to take all necessary steps for the incorporation of the Indian subsidiary including but not limited t</w:t>
       </w:r>
       <w:r>
         <w:rPr>
@@ -795,9 +815,64 @@
           <w:sz w:val="22"/>
           <w:szCs w:val="22"/>
         </w:rPr>
+        <w:br/>
+      </w:r>
+      <w:r>
+        <w:rPr>
+          <w:rFonts w:ascii="Times New Roman" w:hAnsi="Times New Roman" w:cs="Times New Roman"/>
+          <w:sz w:val="22"/>
+          <w:szCs w:val="22"/>
+        </w:rPr>
+        <w:br/>
+      </w:r>
+      <w:r>
+        <w:rPr>
+          <w:rFonts w:ascii="Times New Roman" w:hAnsi="Times New Roman" w:cs="Times New Roman"/>
+          <w:sz w:val="22"/>
+          <w:szCs w:val="22"/>
+        </w:rPr>
+        <w:br/>
+      </w:r>
+      <w:r>
+        <w:rPr>
+          <w:rFonts w:ascii="Times New Roman" w:hAnsi="Times New Roman" w:cs="Times New Roman"/>
+          <w:sz w:val="22"/>
+          <w:szCs w:val="22"/>
+        </w:rPr>
+        <w:br/>
+      </w:r>
+      <w:r>
+        <w:rPr>
+          <w:rFonts w:ascii="Times New Roman" w:hAnsi="Times New Roman" w:cs="Times New Roman"/>
+          <w:sz w:val="22"/>
+          <w:szCs w:val="22"/>
+        </w:rPr>
+        <w:br/>
+      </w:r>
+      <w:r>
+        <w:rPr>
+          <w:rFonts w:ascii="Times New Roman" w:hAnsi="Times New Roman" w:cs="Times New Roman"/>
+          <w:sz w:val="22"/>
+          <w:szCs w:val="22"/>
+        </w:rPr>
+        <w:br/>
+      </w:r>
+      <w:r>
+        <w:rPr>
+          <w:rFonts w:ascii="Times New Roman" w:hAnsi="Times New Roman" w:cs="Times New Roman"/>
+          <w:sz w:val="22"/>
+          <w:szCs w:val="22"/>
+        </w:rPr>
+        <w:br/>
+      </w:r>
+      <w:r>
+        <w:rPr>
+          <w:rFonts w:ascii="Times New Roman" w:hAnsi="Times New Roman" w:cs="Times New Roman"/>
+          <w:sz w:val="22"/>
+          <w:szCs w:val="22"/>
+        </w:rPr>
         <w:t xml:space="preserve">For and on behalf of </w:t>
       </w:r>
-      <w:proofErr w:type="gramStart"/>
       <w:r>
         <w:rPr>
           <w:rFonts w:ascii="Times New Roman" w:hAnsi="Times New Roman" w:cs="Times New Roman"/>
@@ -808,35 +883,52 @@
         </w:rPr>
         <w:t xml:space="preserve">{PARENT_ENTITY_NAME}</w:t>
       </w:r>
-      <w:r>
-        <w:rPr>
-          <w:rFonts w:ascii="Times New Roman" w:hAnsi="Times New Roman" w:cs="Times New Roman"/>
-          <w:b/>
-          <w:bCs/>
-          <w:sz w:val="22"/>
-          <w:szCs w:val="22"/>
-        </w:rPr>
-        <w:t/>
-      </w:r>
-      <w:proofErr w:type="gramEnd"/>
     </w:p>
     <w:p>
       <w:pPr>
-        <w:jc w:val="both"/>
-      </w:pPr>
-      <w:r>
-        <w:rPr>
-          <w:rFonts w:ascii="Times New Roman" w:hAnsi="Times New Roman" w:cs="Times New Roman"/>
-          <w:b/>
-          <w:bCs/>
-          <w:sz w:val="22"/>
-          <w:szCs w:val="22"/>
-        </w:rPr>
-        <w:t xml:space="preserve">{PARENT_ENTITY_ADDRESS}</w:t>
+        <w:spacing w:after="0"/>
+        <w:rPr>
+          <w:rFonts w:ascii="Times New Roman" w:hAnsi="Times New Roman" w:cs="Times New Roman"/>
+          <w:b/>
+          <w:bCs/>
+          <w:sz w:val="22"/>
+          <w:szCs w:val="22"/>
+        </w:rPr>
+      </w:pPr>
+      <w:r>
+        <w:rPr>
+          <w:rFonts w:ascii="Times New Roman" w:hAnsi="Times New Roman" w:cs="Times New Roman"/>
+          <w:b/>
+          <w:bCs/>
+          <w:sz w:val="22"/>
+          <w:szCs w:val="22"/>
+        </w:rPr>
+        <w:t>Authorised Person</w:t>
+      </w:r>
+      <w:r>
+        <w:rPr>
+          <w:rFonts w:ascii="Times New Roman" w:hAnsi="Times New Roman" w:cs="Times New Roman"/>
+          <w:b/>
+          <w:bCs/>
+          <w:sz w:val="22"/>
+          <w:szCs w:val="22"/>
+        </w:rPr>
+        <w:br/>
+      </w:r>
+      <w:r>
+        <w:rPr>
+          <w:rFonts w:ascii="Times New Roman" w:hAnsi="Times New Roman" w:cs="Times New Roman"/>
+          <w:b/>
+          <w:bCs/>
+          <w:sz w:val="22"/>
+          <w:szCs w:val="22"/>
+        </w:rPr>
+        <w:t xml:space="preserve">{SIGNATORY_NAME}</w:t>
       </w:r>
     </w:p>
     <w:p>
       <w:pPr>
+        <w:spacing w:after="0"/>
         <w:jc w:val="both"/>
         <w:rPr>
           <w:rFonts w:ascii="Times New Roman" w:hAnsi="Times New Roman" w:cs="Times New Roman"/>
@@ -846,6 +938,22 @@
           <w:szCs w:val="22"/>
         </w:rPr>
       </w:pPr>
+      <w:r>
+        <w:rPr>
+          <w:rFonts w:ascii="Times New Roman" w:hAnsi="Times New Roman" w:cs="Times New Roman"/>
+          <w:sz w:val="22"/>
+          <w:szCs w:val="22"/>
+        </w:rPr>
+        <w:t>Designation</w:t>
+      </w:r>
+      <w:r>
+        <w:rPr>
+          <w:rFonts w:ascii="Times New Roman" w:hAnsi="Times New Roman" w:cs="Times New Roman"/>
+          <w:sz w:val="22"/>
+          <w:szCs w:val="22"/>
+        </w:rPr>
+        <w:t xml:space="preserve">: {SIGNATORY_DESIGNATION}</w:t>
+      </w:r>
     </w:p>
     <w:p>
       <w:pPr>
@@ -859,16 +967,6 @@
           <w:szCs w:val="22"/>
         </w:rPr>
       </w:pPr>
-      <w:r>
-        <w:rPr>
-          <w:rFonts w:ascii="Times New Roman" w:hAnsi="Times New Roman" w:cs="Times New Roman"/>
-          <w:b/>
-          <w:bCs/>
-          <w:sz w:val="22"/>
-          <w:szCs w:val="22"/>
-        </w:rPr>
-        <w:t>{SIGNATORY_NAME}</w:t>
-      </w:r>
     </w:p>
     <w:p>
       <w:pPr>
@@ -876,19 +974,38 @@
         <w:jc w:val="both"/>
         <w:rPr>
           <w:rFonts w:ascii="Times New Roman" w:hAnsi="Times New Roman" w:cs="Times New Roman"/>
-          <w:b/>
-          <w:bCs/>
-          <w:sz w:val="22"/>
-          <w:szCs w:val="22"/>
-        </w:rPr>
-      </w:pPr>
-      <w:r>
-        <w:rPr>
-          <w:rFonts w:ascii="Times New Roman" w:hAnsi="Times New Roman" w:cs="Times New Roman"/>
-          <w:sz w:val="22"/>
-          <w:szCs w:val="22"/>
-        </w:rPr>
-        <w:t>{SIGNATORY_DESIGNATION}</w:t>
+          <w:sz w:val="22"/>
+          <w:szCs w:val="22"/>
+          <w:u w:val="single"/>
+        </w:rPr>
+      </w:pPr>
+      <w:r>
+        <w:rPr>
+          <w:rFonts w:ascii="Times New Roman" w:hAnsi="Times New Roman" w:cs="Times New Roman"/>
+          <w:b/>
+          <w:bCs/>
+          <w:sz w:val="22"/>
+          <w:szCs w:val="22"/>
+        </w:rPr>
+        <w:t>Date:</w:t>
+      </w:r>
+      <w:r>
+        <w:rPr>
+          <w:rFonts w:ascii="Times New Roman" w:hAnsi="Times New Roman" w:cs="Times New Roman"/>
+          <w:b/>
+          <w:bCs/>
+          <w:sz w:val="22"/>
+          <w:szCs w:val="22"/>
+        </w:rPr>
+        <w:t xml:space="preserve"> </w:t>
+      </w:r>
+      <w:r>
+        <w:rPr>
+          <w:rFonts w:ascii="Times New Roman" w:hAnsi="Times New Roman" w:cs="Times New Roman"/>
+          <w:sz w:val="22"/>
+          <w:szCs w:val="22"/>
+        </w:rPr>
+        <w:t xml:space="preserve">{CERTIFICATION_DATE}</w:t>
       </w:r>
     </w:p>
     <w:p>
@@ -897,147 +1014,47 @@
         <w:jc w:val="both"/>
         <w:rPr>
           <w:rFonts w:ascii="Times New Roman" w:hAnsi="Times New Roman" w:cs="Times New Roman"/>
-          <w:b/>
-          <w:bCs/>
-          <w:sz w:val="22"/>
-          <w:szCs w:val="22"/>
-        </w:rPr>
-      </w:pPr>
-    </w:p>
-    <w:p>
-      <w:pPr>
-        <w:spacing w:after="0"/>
-        <w:jc w:val="both"/>
-        <w:rPr>
-          <w:rFonts w:ascii="Times New Roman" w:hAnsi="Times New Roman" w:cs="Times New Roman"/>
-          <w:sz w:val="22"/>
-          <w:szCs w:val="22"/>
-          <w:u w:val="single"/>
-        </w:rPr>
-      </w:pPr>
-      <w:r>
-        <w:rPr>
-          <w:rFonts w:ascii="Times New Roman" w:hAnsi="Times New Roman" w:cs="Times New Roman"/>
-          <w:b/>
-          <w:bCs/>
-          <w:sz w:val="22"/>
-          <w:szCs w:val="22"/>
-        </w:rPr>
-        <w:t>Date: {CERTIFICATION_DATE}</w:t>
-      </w:r>
-      <w:r>
-        <w:rPr>
-          <w:rFonts w:ascii="Times New Roman" w:hAnsi="Times New Roman" w:cs="Times New Roman"/>
-          <w:b/>
-          <w:bCs/>
-          <w:sz w:val="22"/>
-          <w:szCs w:val="22"/>
-        </w:rPr>
-        <w:t xml:space="preserve"/>
-      </w:r>
-      <w:proofErr w:type="gramStart"/>
-      <w:r>
-        <w:rPr>
-          <w:rFonts w:ascii="Times New Roman" w:hAnsi="Times New Roman" w:cs="Times New Roman"/>
-          <w:sz w:val="22"/>
-          <w:szCs w:val="22"/>
-        </w:rPr>
-        <w:t/>
-      </w:r>
-      <w:r>
-        <w:rPr>
-          <w:rFonts w:ascii="Times New Roman" w:hAnsi="Times New Roman" w:cs="Times New Roman"/>
-          <w:sz w:val="22"/>
-          <w:szCs w:val="22"/>
-          <w:vertAlign w:val="superscript"/>
-        </w:rPr>
-        <w:t/>
-      </w:r>
-      <w:proofErr w:type="gramEnd"/>
-      <w:r>
-        <w:rPr>
-          <w:rFonts w:ascii="Times New Roman" w:hAnsi="Times New Roman" w:cs="Times New Roman"/>
-          <w:sz w:val="22"/>
-          <w:szCs w:val="22"/>
-        </w:rPr>
-        <w:t xml:space="preserve"/>
-      </w:r>
-      <w:proofErr w:type="gramStart"/>
-      <w:r>
-        <w:rPr>
-          <w:rFonts w:ascii="Times New Roman" w:hAnsi="Times New Roman" w:cs="Times New Roman"/>
-          <w:sz w:val="22"/>
-          <w:szCs w:val="22"/>
-        </w:rPr>
-        <w:t/>
-      </w:r>
-      <w:proofErr w:type="gramEnd"/>
-      <w:r>
-        <w:rPr>
-          <w:rFonts w:ascii="Times New Roman" w:hAnsi="Times New Roman" w:cs="Times New Roman"/>
-          <w:sz w:val="22"/>
-          <w:szCs w:val="22"/>
-        </w:rPr>
-        <w:t xml:space="preserve"/>
-      </w:r>
-      <w:r>
-        <w:rPr>
-          <w:rFonts w:ascii="Times New Roman" w:hAnsi="Times New Roman" w:cs="Times New Roman"/>
-          <w:sz w:val="22"/>
-          <w:szCs w:val="22"/>
-          <w:u w:val="single"/>
+          <w:sz w:val="22"/>
+          <w:szCs w:val="22"/>
+        </w:rPr>
+      </w:pPr>
+      <w:r>
+        <w:rPr>
+          <w:rFonts w:ascii="Times New Roman" w:hAnsi="Times New Roman" w:cs="Times New Roman"/>
+          <w:b/>
+          <w:bCs/>
+          <w:sz w:val="22"/>
+          <w:szCs w:val="22"/>
+        </w:rPr>
+        <w:t>Place:</w:t>
+      </w:r>
+      <w:r>
+        <w:rPr>
+          <w:rFonts w:ascii="Times New Roman" w:hAnsi="Times New Roman" w:cs="Times New Roman"/>
+          <w:sz w:val="22"/>
+          <w:szCs w:val="22"/>
         </w:rPr>
         <w:t xml:space="preserve"> </w:t>
       </w:r>
-    </w:p>
-    <w:p>
-      <w:pPr>
-        <w:spacing w:after="0"/>
-        <w:jc w:val="both"/>
-        <w:rPr>
-          <w:rFonts w:ascii="Times New Roman" w:hAnsi="Times New Roman" w:cs="Times New Roman"/>
-          <w:sz w:val="22"/>
-          <w:szCs w:val="22"/>
-        </w:rPr>
-      </w:pPr>
-      <w:r>
-        <w:rPr>
-          <w:rFonts w:ascii="Times New Roman" w:hAnsi="Times New Roman" w:cs="Times New Roman"/>
-          <w:b/>
-          <w:bCs/>
-          <w:sz w:val="22"/>
-          <w:szCs w:val="22"/>
-        </w:rPr>
-        <w:t>Place: {CERTIFICATION_PLACE}</w:t>
-      </w:r>
-      <w:r>
-        <w:rPr>
-          <w:rFonts w:ascii="Times New Roman" w:hAnsi="Times New Roman" w:cs="Times New Roman"/>
-          <w:sz w:val="22"/>
-          <w:szCs w:val="22"/>
-        </w:rPr>
-        <w:t xml:space="preserve"/>
-      </w:r>
-      <w:r>
-        <w:rPr>
-          <w:rFonts w:ascii="Times New Roman" w:hAnsi="Times New Roman" w:cs="Times New Roman"/>
-          <w:sz w:val="22"/>
-          <w:szCs w:val="22"/>
-        </w:rPr>
-        <w:t xml:space="preserve"/>
-      </w:r>
-      <w:r>
-        <w:rPr>
-          <w:rFonts w:ascii="Times New Roman" w:hAnsi="Times New Roman" w:cs="Times New Roman"/>
-          <w:sz w:val="22"/>
-          <w:szCs w:val="22"/>
-        </w:rPr>
-        <w:t/>
+      <w:r>
+        <w:rPr>
+          <w:rFonts w:ascii="Times New Roman" w:hAnsi="Times New Roman" w:cs="Times New Roman"/>
+          <w:sz w:val="22"/>
+          <w:szCs w:val="22"/>
+        </w:rPr>
+        <w:t xml:space="preserve"> </w:t>
+      </w:r>
+      <w:r>
+        <w:rPr>
+          <w:rFonts w:ascii="Times New Roman" w:hAnsi="Times New Roman" w:cs="Times New Roman"/>
+          <w:sz w:val="22"/>
+          <w:szCs w:val="22"/>
+        </w:rPr>
+        <w:t>{CERTIFICATION_PLACE}</w:t>
       </w:r>
     </w:p>
     <w:sectPr>
-      <w:headerReference w:type="default" r:id="rId7"/>
-      <w:footerReference w:type="default" r:id="rId8"/>
+      <w:headerReference w:type="default" r:id="rId14"/>
       <w:pgSz w:w="11906" w:h="16838"/>
       <w:pgMar w:top="1440" w:right="1133" w:bottom="1276" w:left="1134" w:header="708" w:footer="708" w:gutter="0"/>
       <w:cols w:space="708"/>
@@ -1072,66 +1089,6 @@
 </w:endnotes>
 </file>
 
-<file path=word/footer1.xml><?xml version="1.0" encoding="utf-8"?>
-<w:ftr xmlns:wpc="http://schemas.microsoft.com/office/word/2010/wordprocessingCanvas" xmlns:cx="http://schemas.microsoft.com/office/drawing/2014/chartex" xmlns:cx1="http://schemas.microsoft.com/office/drawing/2015/9/8/chartex" xmlns:cx2="http://schemas.microsoft.com/office/drawing/2015/10/21/chartex" xmlns:cx3="http://schemas.microsoft.com/office/drawing/2016/5/9/chartex" xmlns:cx4="http://schemas.microsoft.com/office/drawing/2016/5/10/chartex" xmlns:cx5="http://schemas.microsoft.com/office/drawing/2016/5/11/chartex" xmlns:cx6="http://schemas.microsoft.com/office/drawing/2016/5/12/chartex" xmlns:cx7="http://schemas.microsoft.com/office/drawing/2016/5/13/chartex" xmlns:cx8="http://schemas.microsoft.com/office/drawing/2016/5/14/chartex" xmlns:mc="http://schemas.openxmlformats.org/markup-compatibility/2006" xmlns:aink="http://schemas.microsoft.com/office/drawing/2016/ink" xmlns:am3d="http://schemas.microsoft.com/office/drawing/2017/model3d" xmlns:o="urn:schemas-microsoft-com:office:office" xmlns:oel="http://schemas.microsoft.com/office/2019/extlst" xmlns:r="http://schemas.openxmlformats.org/officeDocument/2006/relationships" xmlns:m="http://schemas.openxmlformats.org/officeDocument/2006/math" xmlns:v="urn:schemas-microsoft-com:vml" xmlns:wp14="http://schemas.microsoft.com/office/word/2010/wordprocessingDrawing" xmlns:wp="http://schemas.openxmlformats.org/drawingml/2006/wordprocessingDrawing" xmlns:w10="urn:schemas-microsoft-com:office:word" xmlns:w="http://schemas.openxmlformats.org/wordprocessingml/2006/main" xmlns:w14="http://schemas.microsoft.com/office/word/2010/wordml" xmlns:w15="http://schemas.microsoft.com/office/word/2012/wordml" xmlns:w16cex="http://schemas.microsoft.com/office/word/2018/wordml/cex" xmlns:w16cid="http://schemas.microsoft.com/office/word/2016/wordml/cid" xmlns:w16="http://schemas.microsoft.com/office/word/2018/wordml" xmlns:w16du="http://schemas.microsoft.com/office/word/2023/wordml/word16du" xmlns:w16sdtdh="http://schemas.microsoft.com/office/word/2020/wordml/sdtdatahash" xmlns:w16sdtfl="http://schemas.microsoft.com/office/word/2024/wordml/sdtformatlock" xmlns:w16se="http://schemas.microsoft.com/office/word/2015/wordml/symex" xmlns:wpg="http://schemas.microsoft.com/office/word/2010/wordprocessingGroup" xmlns:wpi="http://schemas.microsoft.com/office/word/2010/wordprocessingInk" xmlns:wne="http://schemas.microsoft.com/office/word/2006/wordml" xmlns:wps="http://schemas.microsoft.com/office/word/2010/wordprocessingShape" mc:Ignorable="w14 w15 w16se w16cid w16 w16cex w16sdtdh w16sdtfl w16du wp14">
-  <w:tbl>
-    <w:tblPr>
-      <w:tblW w:w="0" w:type="auto"/>
-      <w:tblLook w:val="06A0" w:firstRow="1" w:lastRow="0" w:firstColumn="1" w:lastColumn="0" w:noHBand="1" w:noVBand="1"/>
-    </w:tblPr>
-    <w:tblGrid>
-      <w:gridCol w:w="3210"/>
-      <w:gridCol w:w="3210"/>
-      <w:gridCol w:w="3210"/>
-    </w:tblGrid>
-    <w:tr>
-      <w:trPr>
-        <w:trHeight w:val="300"/>
-      </w:trPr>
-      <w:tc>
-        <w:tcPr>
-          <w:tcW w:w="3210" w:type="dxa"/>
-        </w:tcPr>
-        <w:p>
-          <w:pPr>
-            <w:pStyle w:val="Header"/>
-            <w:ind w:left="-115"/>
-          </w:pPr>
-        </w:p>
-      </w:tc>
-      <w:tc>
-        <w:tcPr>
-          <w:tcW w:w="3210" w:type="dxa"/>
-        </w:tcPr>
-        <w:p>
-          <w:pPr>
-            <w:pStyle w:val="Header"/>
-            <w:jc w:val="center"/>
-          </w:pPr>
-        </w:p>
-      </w:tc>
-      <w:tc>
-        <w:tcPr>
-          <w:tcW w:w="3210" w:type="dxa"/>
-        </w:tcPr>
-        <w:p>
-          <w:pPr>
-            <w:pStyle w:val="Header"/>
-            <w:ind w:right="-115"/>
-            <w:jc w:val="right"/>
-          </w:pPr>
-        </w:p>
-      </w:tc>
-    </w:tr>
-  </w:tbl>
-  <w:p>
-    <w:pPr>
-      <w:pStyle w:val="Footer"/>
-    </w:pPr>
-  </w:p>
-</w:ftr>
-</file>
-
 <file path=word/footnotes.xml><?xml version="1.0" encoding="utf-8"?>
 <w:footnotes xmlns:wpc="http://schemas.microsoft.com/office/word/2010/wordprocessingCanvas" xmlns:cx="http://schemas.microsoft.com/office/drawing/2014/chartex" xmlns:cx1="http://schemas.microsoft.com/office/drawing/2015/9/8/chartex" xmlns:cx2="http://schemas.microsoft.com/office/drawing/2015/10/21/chartex" xmlns:cx3="http://schemas.microsoft.com/office/drawing/2016/5/9/chartex" xmlns:cx4="http://schemas.microsoft.com/office/drawing/2016/5/10/chartex" xmlns:cx5="http://schemas.microsoft.com/office/drawing/2016/5/11/chartex" xmlns:cx6="http://schemas.microsoft.com/office/drawing/2016/5/12/chartex" xmlns:cx7="http://schemas.microsoft.com/office/drawing/2016/5/13/chartex" xmlns:cx8="http://schemas.microsoft.com/office/drawing/2016/5/14/chartex" xmlns:mc="http://schemas.openxmlformats.org/markup-compatibility/2006" xmlns:aink="http://schemas.microsoft.com/office/drawing/2016/ink" xmlns:am3d="http://schemas.microsoft.com/office/drawing/2017/model3d" xmlns:o="urn:schemas-microsoft-com:office:office" xmlns:oel="http://schemas.microsoft.com/office/2019/extlst" xmlns:r="http://schemas.openxmlformats.org/officeDocument/2006/relationships" xmlns:m="http://schemas.openxmlformats.org/officeDocument/2006/math" xmlns:v="urn:schemas-microsoft-com:vml" xmlns:wp14="http://schemas.microsoft.com/office/word/2010/wordprocessingDrawing" xmlns:wp="http://schemas.openxmlformats.org/drawingml/2006/wordprocessingDrawing" xmlns:w10="urn:schemas-microsoft-com:office:word" xmlns:w="http://schemas.openxmlformats.org/wordprocessingml/2006/main" xmlns:w14="http://schemas.microsoft.com/office/word/2010/wordml" xmlns:w15="http://schemas.microsoft.com/office/word/2012/wordml" xmlns:w16cex="http://schemas.microsoft.com/office/word/2018/wordml/cex" xmlns:w16cid="http://schemas.microsoft.com/office/word/2016/wordml/cid" xmlns:w16="http://schemas.microsoft.com/office/word/2018/wordml" xmlns:w16du="http://schemas.microsoft.com/office/word/2023/wordml/word16du" xmlns:w16sdtdh="http://schemas.microsoft.com/office/word/2020/wordml/sdtdatahash" xmlns:w16sdtfl="http://schemas.microsoft.com/office/word/2024/wordml/sdtformatlock" xmlns:w16se="http://schemas.microsoft.com/office/word/2015/wordml/symex" xmlns:wpg="http://schemas.microsoft.com/office/word/2010/wordprocessingGroup" xmlns:wpi="http://schemas.microsoft.com/office/word/2010/wordprocessingInk" xmlns:wne="http://schemas.microsoft.com/office/word/2006/wordml" xmlns:wps="http://schemas.microsoft.com/office/word/2010/wordprocessingShape" mc:Ignorable="w14 w15 w16se w16cid w16 w16cex w16sdtdh w16sdtfl w16du wp14">
   <w:footnote w:type="separator" w:id="-1">
@@ -1482,11 +1439,315 @@
       </w:rPr>
     </w:lvl>
   </w:abstractNum>
+  <w:abstractNum w:abstractNumId="2" w15:restartNumberingAfterBreak="0">
+    <w:nsid w:val="355D63D3"/>
+    <w:multiLevelType w:val="multilevel"/>
+    <w:tmpl w:val="3A8EE000"/>
+    <w:lvl w:ilvl="0">
+      <w:start w:val="1"/>
+      <w:numFmt w:val="bullet"/>
+      <w:lvlText w:val=""/>
+      <w:lvlJc w:val="left"/>
+      <w:pPr>
+        <w:tabs>
+          <w:tab w:val="num" w:pos="2160"/>
+        </w:tabs>
+        <w:ind w:left="2160" w:hanging="360"/>
+      </w:pPr>
+      <w:rPr>
+        <w:rFonts w:ascii="Symbol" w:hAnsi="Symbol" w:hint="default"/>
+        <w:sz w:val="20"/>
+      </w:rPr>
+    </w:lvl>
+    <w:lvl w:ilvl="1" w:tentative="1">
+      <w:start w:val="1"/>
+      <w:numFmt w:val="bullet"/>
+      <w:lvlText w:val="o"/>
+      <w:lvlJc w:val="left"/>
+      <w:pPr>
+        <w:tabs>
+          <w:tab w:val="num" w:pos="2880"/>
+        </w:tabs>
+        <w:ind w:left="2880" w:hanging="360"/>
+      </w:pPr>
+      <w:rPr>
+        <w:rFonts w:ascii="Courier New" w:hAnsi="Courier New" w:hint="default"/>
+        <w:sz w:val="20"/>
+      </w:rPr>
+    </w:lvl>
+    <w:lvl w:ilvl="2" w:tentative="1">
+      <w:start w:val="1"/>
+      <w:numFmt w:val="bullet"/>
+      <w:lvlText w:val=""/>
+      <w:lvlJc w:val="left"/>
+      <w:pPr>
+        <w:tabs>
+          <w:tab w:val="num" w:pos="3600"/>
+        </w:tabs>
+        <w:ind w:left="3600" w:hanging="360"/>
+      </w:pPr>
+      <w:rPr>
+        <w:rFonts w:ascii="Wingdings" w:hAnsi="Wingdings" w:hint="default"/>
+        <w:sz w:val="20"/>
+      </w:rPr>
+    </w:lvl>
+    <w:lvl w:ilvl="3" w:tentative="1">
+      <w:start w:val="1"/>
+      <w:numFmt w:val="bullet"/>
+      <w:lvlText w:val=""/>
+      <w:lvlJc w:val="left"/>
+      <w:pPr>
+        <w:tabs>
+          <w:tab w:val="num" w:pos="4320"/>
+        </w:tabs>
+        <w:ind w:left="4320" w:hanging="360"/>
+      </w:pPr>
+      <w:rPr>
+        <w:rFonts w:ascii="Wingdings" w:hAnsi="Wingdings" w:hint="default"/>
+        <w:sz w:val="20"/>
+      </w:rPr>
+    </w:lvl>
+    <w:lvl w:ilvl="4" w:tentative="1">
+      <w:start w:val="1"/>
+      <w:numFmt w:val="bullet"/>
+      <w:lvlText w:val=""/>
+      <w:lvlJc w:val="left"/>
+      <w:pPr>
+        <w:tabs>
+          <w:tab w:val="num" w:pos="5040"/>
+        </w:tabs>
+        <w:ind w:left="5040" w:hanging="360"/>
+      </w:pPr>
+      <w:rPr>
+        <w:rFonts w:ascii="Wingdings" w:hAnsi="Wingdings" w:hint="default"/>
+        <w:sz w:val="20"/>
+      </w:rPr>
+    </w:lvl>
+    <w:lvl w:ilvl="5" w:tentative="1">
+      <w:start w:val="1"/>
+      <w:numFmt w:val="bullet"/>
+      <w:lvlText w:val=""/>
+      <w:lvlJc w:val="left"/>
+      <w:pPr>
+        <w:tabs>
+          <w:tab w:val="num" w:pos="5760"/>
+        </w:tabs>
+        <w:ind w:left="5760" w:hanging="360"/>
+      </w:pPr>
+      <w:rPr>
+        <w:rFonts w:ascii="Wingdings" w:hAnsi="Wingdings" w:hint="default"/>
+        <w:sz w:val="20"/>
+      </w:rPr>
+    </w:lvl>
+    <w:lvl w:ilvl="6" w:tentative="1">
+      <w:start w:val="1"/>
+      <w:numFmt w:val="bullet"/>
+      <w:lvlText w:val=""/>
+      <w:lvlJc w:val="left"/>
+      <w:pPr>
+        <w:tabs>
+          <w:tab w:val="num" w:pos="6480"/>
+        </w:tabs>
+        <w:ind w:left="6480" w:hanging="360"/>
+      </w:pPr>
+      <w:rPr>
+        <w:rFonts w:ascii="Wingdings" w:hAnsi="Wingdings" w:hint="default"/>
+        <w:sz w:val="20"/>
+      </w:rPr>
+    </w:lvl>
+    <w:lvl w:ilvl="7" w:tentative="1">
+      <w:start w:val="1"/>
+      <w:numFmt w:val="bullet"/>
+      <w:lvlText w:val=""/>
+      <w:lvlJc w:val="left"/>
+      <w:pPr>
+        <w:tabs>
+          <w:tab w:val="num" w:pos="7200"/>
+        </w:tabs>
+        <w:ind w:left="7200" w:hanging="360"/>
+      </w:pPr>
+      <w:rPr>
+        <w:rFonts w:ascii="Wingdings" w:hAnsi="Wingdings" w:hint="default"/>
+        <w:sz w:val="20"/>
+      </w:rPr>
+    </w:lvl>
+    <w:lvl w:ilvl="8" w:tentative="1">
+      <w:start w:val="1"/>
+      <w:numFmt w:val="bullet"/>
+      <w:lvlText w:val=""/>
+      <w:lvlJc w:val="left"/>
+      <w:pPr>
+        <w:tabs>
+          <w:tab w:val="num" w:pos="7920"/>
+        </w:tabs>
+        <w:ind w:left="7920" w:hanging="360"/>
+      </w:pPr>
+      <w:rPr>
+        <w:rFonts w:ascii="Wingdings" w:hAnsi="Wingdings" w:hint="default"/>
+        <w:sz w:val="20"/>
+      </w:rPr>
+    </w:lvl>
+  </w:abstractNum>
+  <w:abstractNum w:abstractNumId="3" w15:restartNumberingAfterBreak="0">
+    <w:nsid w:val="58630F5E"/>
+    <w:multiLevelType w:val="multilevel"/>
+    <w:tmpl w:val="3A8EE000"/>
+    <w:lvl w:ilvl="0">
+      <w:start w:val="1"/>
+      <w:numFmt w:val="bullet"/>
+      <w:lvlText w:val=""/>
+      <w:lvlJc w:val="left"/>
+      <w:pPr>
+        <w:tabs>
+          <w:tab w:val="num" w:pos="2160"/>
+        </w:tabs>
+        <w:ind w:left="2160" w:hanging="360"/>
+      </w:pPr>
+      <w:rPr>
+        <w:rFonts w:ascii="Symbol" w:hAnsi="Symbol" w:hint="default"/>
+        <w:sz w:val="20"/>
+      </w:rPr>
+    </w:lvl>
+    <w:lvl w:ilvl="1" w:tentative="1">
+      <w:start w:val="1"/>
+      <w:numFmt w:val="bullet"/>
+      <w:lvlText w:val="o"/>
+      <w:lvlJc w:val="left"/>
+      <w:pPr>
+        <w:tabs>
+          <w:tab w:val="num" w:pos="2880"/>
+        </w:tabs>
+        <w:ind w:left="2880" w:hanging="360"/>
+      </w:pPr>
+      <w:rPr>
+        <w:rFonts w:ascii="Courier New" w:hAnsi="Courier New" w:hint="default"/>
+        <w:sz w:val="20"/>
+      </w:rPr>
+    </w:lvl>
+    <w:lvl w:ilvl="2" w:tentative="1">
+      <w:start w:val="1"/>
+      <w:numFmt w:val="bullet"/>
+      <w:lvlText w:val=""/>
+      <w:lvlJc w:val="left"/>
+      <w:pPr>
+        <w:tabs>
+          <w:tab w:val="num" w:pos="3600"/>
+        </w:tabs>
+        <w:ind w:left="3600" w:hanging="360"/>
+      </w:pPr>
+      <w:rPr>
+        <w:rFonts w:ascii="Wingdings" w:hAnsi="Wingdings" w:hint="default"/>
+        <w:sz w:val="20"/>
+      </w:rPr>
+    </w:lvl>
+    <w:lvl w:ilvl="3" w:tentative="1">
+      <w:start w:val="1"/>
+      <w:numFmt w:val="bullet"/>
+      <w:lvlText w:val=""/>
+      <w:lvlJc w:val="left"/>
+      <w:pPr>
+        <w:tabs>
+          <w:tab w:val="num" w:pos="4320"/>
+        </w:tabs>
+        <w:ind w:left="4320" w:hanging="360"/>
+      </w:pPr>
+      <w:rPr>
+        <w:rFonts w:ascii="Wingdings" w:hAnsi="Wingdings" w:hint="default"/>
+        <w:sz w:val="20"/>
+      </w:rPr>
+    </w:lvl>
+    <w:lvl w:ilvl="4" w:tentative="1">
+      <w:start w:val="1"/>
+      <w:numFmt w:val="bullet"/>
+      <w:lvlText w:val=""/>
+      <w:lvlJc w:val="left"/>
+      <w:pPr>
+        <w:tabs>
+          <w:tab w:val="num" w:pos="5040"/>
+        </w:tabs>
+        <w:ind w:left="5040" w:hanging="360"/>
+      </w:pPr>
+      <w:rPr>
+        <w:rFonts w:ascii="Wingdings" w:hAnsi="Wingdings" w:hint="default"/>
+        <w:sz w:val="20"/>
+      </w:rPr>
+    </w:lvl>
+    <w:lvl w:ilvl="5" w:tentative="1">
+      <w:start w:val="1"/>
+      <w:numFmt w:val="bullet"/>
+      <w:lvlText w:val=""/>
+      <w:lvlJc w:val="left"/>
+      <w:pPr>
+        <w:tabs>
+          <w:tab w:val="num" w:pos="5760"/>
+        </w:tabs>
+        <w:ind w:left="5760" w:hanging="360"/>
+      </w:pPr>
+      <w:rPr>
+        <w:rFonts w:ascii="Wingdings" w:hAnsi="Wingdings" w:hint="default"/>
+        <w:sz w:val="20"/>
+      </w:rPr>
+    </w:lvl>
+    <w:lvl w:ilvl="6" w:tentative="1">
+      <w:start w:val="1"/>
+      <w:numFmt w:val="bullet"/>
+      <w:lvlText w:val=""/>
+      <w:lvlJc w:val="left"/>
+      <w:pPr>
+        <w:tabs>
+          <w:tab w:val="num" w:pos="6480"/>
+        </w:tabs>
+        <w:ind w:left="6480" w:hanging="360"/>
+      </w:pPr>
+      <w:rPr>
+        <w:rFonts w:ascii="Wingdings" w:hAnsi="Wingdings" w:hint="default"/>
+        <w:sz w:val="20"/>
+      </w:rPr>
+    </w:lvl>
+    <w:lvl w:ilvl="7" w:tentative="1">
+      <w:start w:val="1"/>
+      <w:numFmt w:val="bullet"/>
+      <w:lvlText w:val=""/>
+      <w:lvlJc w:val="left"/>
+      <w:pPr>
+        <w:tabs>
+          <w:tab w:val="num" w:pos="7200"/>
+        </w:tabs>
+        <w:ind w:left="7200" w:hanging="360"/>
+      </w:pPr>
+      <w:rPr>
+        <w:rFonts w:ascii="Wingdings" w:hAnsi="Wingdings" w:hint="default"/>
+        <w:sz w:val="20"/>
+      </w:rPr>
+    </w:lvl>
+    <w:lvl w:ilvl="8" w:tentative="1">
+      <w:start w:val="1"/>
+      <w:numFmt w:val="bullet"/>
+      <w:lvlText w:val=""/>
+      <w:lvlJc w:val="left"/>
+      <w:pPr>
+        <w:tabs>
+          <w:tab w:val="num" w:pos="7920"/>
+        </w:tabs>
+        <w:ind w:left="7920" w:hanging="360"/>
+      </w:pPr>
+      <w:rPr>
+        <w:rFonts w:ascii="Wingdings" w:hAnsi="Wingdings" w:hint="default"/>
+        <w:sz w:val="20"/>
+      </w:rPr>
+    </w:lvl>
+  </w:abstractNum>
   <w:num w:numId="1" w16cid:durableId="77792039">
     <w:abstractNumId w:val="0"/>
   </w:num>
   <w:num w:numId="2" w16cid:durableId="117995500">
     <w:abstractNumId w:val="1"/>
+  </w:num>
+  <w:num w:numId="3" w16cid:durableId="836841663">
+    <w:abstractNumId w:val="3"/>
+  </w:num>
+  <w:num w:numId="4" w16cid:durableId="1746679702">
+    <w:abstractNumId w:val="2"/>
   </w:num>
 </w:numbering>
 </file>
@@ -2452,24 +2713,71 @@
     <w:uiPriority w:val="99"/>
     <w:rsid w:val="003C39B8"/>
   </w:style>
-  <w:style w:type="table" w:styleId="TableGrid">
-    <w:name w:val="Table Grid"/>
-    <w:basedOn w:val="TableNormal"/>
-    <w:uiPriority w:val="59"/>
-    <w:rsid w:val="00FB4123"/>
+  <w:style w:type="character" w:styleId="CommentReference">
+    <w:name w:val="annotation reference"/>
+    <w:basedOn w:val="DefaultParagraphFont"/>
+    <w:uiPriority w:val="99"/>
+    <w:semiHidden/>
+    <w:unhideWhenUsed/>
+    <w:rsid w:val="00CC41AF"/>
+    <w:rPr>
+      <w:sz w:val="16"/>
+      <w:szCs w:val="16"/>
+    </w:rPr>
+  </w:style>
+  <w:style w:type="paragraph" w:styleId="CommentText">
+    <w:name w:val="annotation text"/>
+    <w:basedOn w:val="Normal"/>
+    <w:link w:val="CommentTextChar"/>
+    <w:uiPriority w:val="99"/>
+    <w:unhideWhenUsed/>
+    <w:rsid w:val="00CC41AF"/>
     <w:pPr>
-      <w:spacing w:after="0" w:line="240" w:lineRule="auto"/>
+      <w:spacing w:line="240" w:lineRule="auto"/>
     </w:pPr>
-    <w:tblPr>
-      <w:tblBorders>
-        <w:top w:val="single" w:sz="4" w:space="0" w:color="000000" w:themeColor="text1"/>
-        <w:left w:val="single" w:sz="4" w:space="0" w:color="000000" w:themeColor="text1"/>
-        <w:bottom w:val="single" w:sz="4" w:space="0" w:color="000000" w:themeColor="text1"/>
-        <w:right w:val="single" w:sz="4" w:space="0" w:color="000000" w:themeColor="text1"/>
-        <w:insideH w:val="single" w:sz="4" w:space="0" w:color="000000" w:themeColor="text1"/>
-        <w:insideV w:val="single" w:sz="4" w:space="0" w:color="000000" w:themeColor="text1"/>
-      </w:tblBorders>
-    </w:tblPr>
+    <w:rPr>
+      <w:sz w:val="20"/>
+      <w:szCs w:val="20"/>
+    </w:rPr>
+  </w:style>
+  <w:style w:type="character" w:customStyle="1" w:styleId="CommentTextChar">
+    <w:name w:val="Comment Text Char"/>
+    <w:basedOn w:val="DefaultParagraphFont"/>
+    <w:link w:val="CommentText"/>
+    <w:uiPriority w:val="99"/>
+    <w:rsid w:val="00CC41AF"/>
+    <w:rPr>
+      <w:sz w:val="20"/>
+      <w:szCs w:val="20"/>
+    </w:rPr>
+  </w:style>
+  <w:style w:type="paragraph" w:styleId="CommentSubject">
+    <w:name w:val="annotation subject"/>
+    <w:basedOn w:val="CommentText"/>
+    <w:next w:val="CommentText"/>
+    <w:link w:val="CommentSubjectChar"/>
+    <w:uiPriority w:val="99"/>
+    <w:semiHidden/>
+    <w:unhideWhenUsed/>
+    <w:rsid w:val="00CC41AF"/>
+    <w:rPr>
+      <w:b/>
+      <w:bCs/>
+    </w:rPr>
+  </w:style>
+  <w:style w:type="character" w:customStyle="1" w:styleId="CommentSubjectChar">
+    <w:name w:val="Comment Subject Char"/>
+    <w:basedOn w:val="CommentTextChar"/>
+    <w:link w:val="CommentSubject"/>
+    <w:uiPriority w:val="99"/>
+    <w:semiHidden/>
+    <w:rsid w:val="00CC41AF"/>
+    <w:rPr>
+      <w:b/>
+      <w:bCs/>
+      <w:sz w:val="20"/>
+      <w:szCs w:val="20"/>
+    </w:rPr>
   </w:style>
 </w:styles>
 </file>
@@ -2767,4 +3075,323 @@
     </a:ext>
   </a:extLst>
 </a:theme>
+</file>
+
+<file path=customXml/item1.xml><?xml version="1.0" encoding="utf-8"?>
+<p:properties xmlns:p="http://schemas.microsoft.com/office/2006/metadata/properties" xmlns:xsi="http://www.w3.org/2001/XMLSchema-instance" xmlns:pc="http://schemas.microsoft.com/office/infopath/2007/PartnerControls">
+  <documentManagement>
+    <lcf76f155ced4ddcb4097134ff3c332f xmlns="0bf1b813-6d60-456d-8ecd-8495dbc8f9d4">
+      <Terms xmlns="http://schemas.microsoft.com/office/infopath/2007/PartnerControls"/>
+    </lcf76f155ced4ddcb4097134ff3c332f>
+    <TaxCatchAll xmlns="ab1e2af6-65fe-48fe-a6ac-2a61b1d19085" xsi:nil="true"/>
+  </documentManagement>
+</p:properties>
+</file>
+
+<file path=customXml/item2.xml><?xml version="1.0" encoding="utf-8"?>
+<?mso-contentType ?>
+<FormTemplates xmlns="http://schemas.microsoft.com/sharepoint/v3/contenttype/forms">
+  <Display>DocumentLibraryForm</Display>
+  <Edit>DocumentLibraryForm</Edit>
+  <New>DocumentLibraryForm</New>
+</FormTemplates>
+</file>
+
+<file path=customXml/item3.xml><?xml version="1.0" encoding="utf-8"?>
+<ct:contentTypeSchema xmlns:ct="http://schemas.microsoft.com/office/2006/metadata/contentType" xmlns:ma="http://schemas.microsoft.com/office/2006/metadata/properties/metaAttributes" ct:_="" ma:_="" ma:contentTypeName="Document" ma:contentTypeID="0x01010054BF458C13FB7640AA5B9D1127D8D7BC" ma:contentTypeVersion="19" ma:contentTypeDescription="Create a new document." ma:contentTypeScope="" ma:versionID="6213bfd6b6e3e1bd458d702e75f3f38c">
+  <xsd:schema xmlns:xsd="http://www.w3.org/2001/XMLSchema" xmlns:xs="http://www.w3.org/2001/XMLSchema" xmlns:p="http://schemas.microsoft.com/office/2006/metadata/properties" xmlns:ns2="0bf1b813-6d60-456d-8ecd-8495dbc8f9d4" xmlns:ns3="ab1e2af6-65fe-48fe-a6ac-2a61b1d19085" targetNamespace="http://schemas.microsoft.com/office/2006/metadata/properties" ma:root="true" ma:fieldsID="260954b090be844abed97d9040bd65de" ns2:_="" ns3:_="">
+    <xsd:import namespace="0bf1b813-6d60-456d-8ecd-8495dbc8f9d4"/>
+    <xsd:import namespace="ab1e2af6-65fe-48fe-a6ac-2a61b1d19085"/>
+    <xsd:element name="properties">
+      <xsd:complexType>
+        <xsd:sequence>
+          <xsd:element name="documentManagement">
+            <xsd:complexType>
+              <xsd:all>
+                <xsd:element ref="ns2:MediaServiceMetadata" minOccurs="0"/>
+                <xsd:element ref="ns2:MediaServiceFastMetadata" minOccurs="0"/>
+                <xsd:element ref="ns2:MediaServiceAutoTags" minOccurs="0"/>
+                <xsd:element ref="ns2:MediaServiceOCR" minOccurs="0"/>
+                <xsd:element ref="ns2:MediaServiceGenerationTime" minOccurs="0"/>
+                <xsd:element ref="ns2:MediaServiceEventHashCode" minOccurs="0"/>
+                <xsd:element ref="ns2:MediaServiceDateTaken" minOccurs="0"/>
+                <xsd:element ref="ns2:MediaServiceLocation" minOccurs="0"/>
+                <xsd:element ref="ns3:SharedWithUsers" minOccurs="0"/>
+                <xsd:element ref="ns3:SharedWithDetails" minOccurs="0"/>
+                <xsd:element ref="ns2:MediaServiceAutoKeyPoints" minOccurs="0"/>
+                <xsd:element ref="ns2:MediaServiceKeyPoints" minOccurs="0"/>
+                <xsd:element ref="ns2:MediaLengthInSeconds" minOccurs="0"/>
+                <xsd:element ref="ns2:lcf76f155ced4ddcb4097134ff3c332f" minOccurs="0"/>
+                <xsd:element ref="ns3:TaxCatchAll" minOccurs="0"/>
+                <xsd:element ref="ns2:MediaServiceObjectDetectorVersions" minOccurs="0"/>
+                <xsd:element ref="ns2:MediaServiceSearchProperties" minOccurs="0"/>
+                <xsd:element ref="ns2:MediaServiceBillingMetadata" minOccurs="0"/>
+              </xsd:all>
+            </xsd:complexType>
+          </xsd:element>
+        </xsd:sequence>
+      </xsd:complexType>
+    </xsd:element>
+  </xsd:schema>
+  <xsd:schema xmlns:xsd="http://www.w3.org/2001/XMLSchema" xmlns:xs="http://www.w3.org/2001/XMLSchema" xmlns:dms="http://schemas.microsoft.com/office/2006/documentManagement/types" xmlns:pc="http://schemas.microsoft.com/office/infopath/2007/PartnerControls" targetNamespace="0bf1b813-6d60-456d-8ecd-8495dbc8f9d4" elementFormDefault="qualified">
+    <xsd:import namespace="http://schemas.microsoft.com/office/2006/documentManagement/types"/>
+    <xsd:import namespace="http://schemas.microsoft.com/office/infopath/2007/PartnerControls"/>
+    <xsd:element name="MediaServiceMetadata" ma:index="8" nillable="true" ma:displayName="MediaServiceMetadata" ma:hidden="true" ma:internalName="MediaServiceMetadata" ma:readOnly="true">
+      <xsd:simpleType>
+        <xsd:restriction base="dms:Note"/>
+      </xsd:simpleType>
+    </xsd:element>
+    <xsd:element name="MediaServiceFastMetadata" ma:index="9" nillable="true" ma:displayName="MediaServiceFastMetadata" ma:hidden="true" ma:internalName="MediaServiceFastMetadata" ma:readOnly="true">
+      <xsd:simpleType>
+        <xsd:restriction base="dms:Note"/>
+      </xsd:simpleType>
+    </xsd:element>
+    <xsd:element name="MediaServiceAutoTags" ma:index="10" nillable="true" ma:displayName="Tags" ma:internalName="MediaServiceAutoTags" ma:readOnly="true">
+      <xsd:simpleType>
+        <xsd:restriction base="dms:Text"/>
+      </xsd:simpleType>
+    </xsd:element>
+    <xsd:element name="MediaServiceOCR" ma:index="11" nillable="true" ma:displayName="Extracted Text" ma:internalName="MediaServiceOCR" ma:readOnly="true">
+      <xsd:simpleType>
+        <xsd:restriction base="dms:Note">
+          <xsd:maxLength value="255"/>
+        </xsd:restriction>
+      </xsd:simpleType>
+    </xsd:element>
+    <xsd:element name="MediaServiceGenerationTime" ma:index="12" nillable="true" ma:displayName="MediaServiceGenerationTime" ma:hidden="true" ma:internalName="MediaServiceGenerationTime" ma:readOnly="true">
+      <xsd:simpleType>
+        <xsd:restriction base="dms:Text"/>
+      </xsd:simpleType>
+    </xsd:element>
+    <xsd:element name="MediaServiceEventHashCode" ma:index="13" nillable="true" ma:displayName="MediaServiceEventHashCode" ma:hidden="true" ma:internalName="MediaServiceEventHashCode" ma:readOnly="true">
+      <xsd:simpleType>
+        <xsd:restriction base="dms:Text"/>
+      </xsd:simpleType>
+    </xsd:element>
+    <xsd:element name="MediaServiceDateTaken" ma:index="14" nillable="true" ma:displayName="MediaServiceDateTaken" ma:hidden="true" ma:internalName="MediaServiceDateTaken" ma:readOnly="true">
+      <xsd:simpleType>
+        <xsd:restriction base="dms:Text"/>
+      </xsd:simpleType>
+    </xsd:element>
+    <xsd:element name="MediaServiceLocation" ma:index="15" nillable="true" ma:displayName="Location" ma:internalName="MediaServiceLocation" ma:readOnly="true">
+      <xsd:simpleType>
+        <xsd:restriction base="dms:Text"/>
+      </xsd:simpleType>
+    </xsd:element>
+    <xsd:element name="MediaServiceAutoKeyPoints" ma:index="18" nillable="true" ma:displayName="MediaServiceAutoKeyPoints" ma:hidden="true" ma:internalName="MediaServiceAutoKeyPoints" ma:readOnly="true">
+      <xsd:simpleType>
+        <xsd:restriction base="dms:Note"/>
+      </xsd:simpleType>
+    </xsd:element>
+    <xsd:element name="MediaServiceKeyPoints" ma:index="19" nillable="true" ma:displayName="KeyPoints" ma:internalName="MediaServiceKeyPoints" ma:readOnly="true">
+      <xsd:simpleType>
+        <xsd:restriction base="dms:Note">
+          <xsd:maxLength value="255"/>
+        </xsd:restriction>
+      </xsd:simpleType>
+    </xsd:element>
+    <xsd:element name="MediaLengthInSeconds" ma:index="20" nillable="true" ma:displayName="Length (seconds)" ma:internalName="MediaLengthInSeconds" ma:readOnly="true">
+      <xsd:simpleType>
+        <xsd:restriction base="dms:Unknown"/>
+      </xsd:simpleType>
+    </xsd:element>
+    <xsd:element name="lcf76f155ced4ddcb4097134ff3c332f" ma:index="22" nillable="true" ma:taxonomy="true" ma:internalName="lcf76f155ced4ddcb4097134ff3c332f" ma:taxonomyFieldName="MediaServiceImageTags" ma:displayName="Image Tags" ma:readOnly="false" ma:fieldId="{5cf76f15-5ced-4ddc-b409-7134ff3c332f}" ma:taxonomyMulti="true" ma:sspId="01e81edd-e918-41f4-a8ab-c4b8505963db" ma:termSetId="09814cd3-568e-fe90-9814-8d621ff8fb84" ma:anchorId="fba54fb3-c3e1-fe81-a776-ca4b69148c4d" ma:open="true" ma:isKeyword="false">
+      <xsd:complexType>
+        <xsd:sequence>
+          <xsd:element ref="pc:Terms" minOccurs="0" maxOccurs="1"/>
+        </xsd:sequence>
+      </xsd:complexType>
+    </xsd:element>
+    <xsd:element name="MediaServiceObjectDetectorVersions" ma:index="24" nillable="true" ma:displayName="MediaServiceObjectDetectorVersions" ma:description="" ma:hidden="true" ma:indexed="true" ma:internalName="MediaServiceObjectDetectorVersions" ma:readOnly="true">
+      <xsd:simpleType>
+        <xsd:restriction base="dms:Text"/>
+      </xsd:simpleType>
+    </xsd:element>
+    <xsd:element name="MediaServiceSearchProperties" ma:index="25" nillable="true" ma:displayName="MediaServiceSearchProperties" ma:hidden="true" ma:internalName="MediaServiceSearchProperties" ma:readOnly="true">
+      <xsd:simpleType>
+        <xsd:restriction base="dms:Note"/>
+      </xsd:simpleType>
+    </xsd:element>
+    <xsd:element name="MediaServiceBillingMetadata" ma:index="26" nillable="true" ma:displayName="MediaServiceBillingMetadata" ma:hidden="true" ma:internalName="MediaServiceBillingMetadata" ma:readOnly="true">
+      <xsd:simpleType>
+        <xsd:restriction base="dms:Note"/>
+      </xsd:simpleType>
+    </xsd:element>
+  </xsd:schema>
+  <xsd:schema xmlns:xsd="http://www.w3.org/2001/XMLSchema" xmlns:xs="http://www.w3.org/2001/XMLSchema" xmlns:dms="http://schemas.microsoft.com/office/2006/documentManagement/types" xmlns:pc="http://schemas.microsoft.com/office/infopath/2007/PartnerControls" targetNamespace="ab1e2af6-65fe-48fe-a6ac-2a61b1d19085" elementFormDefault="qualified">
+    <xsd:import namespace="http://schemas.microsoft.com/office/2006/documentManagement/types"/>
+    <xsd:import namespace="http://schemas.microsoft.com/office/infopath/2007/PartnerControls"/>
+    <xsd:element name="SharedWithUsers" ma:index="16" nillable="true" ma:displayName="Shared With" ma:internalName="SharedWithUsers" ma:readOnly="true">
+      <xsd:complexType>
+        <xsd:complexContent>
+          <xsd:extension base="dms:UserMulti">
+            <xsd:sequence>
+              <xsd:element name="UserInfo" minOccurs="0" maxOccurs="unbounded">
+                <xsd:complexType>
+                  <xsd:sequence>
+                    <xsd:element name="DisplayName" type="xsd:string" minOccurs="0"/>
+                    <xsd:element name="AccountId" type="dms:UserId" minOccurs="0" nillable="true"/>
+                    <xsd:element name="AccountType" type="xsd:string" minOccurs="0"/>
+                  </xsd:sequence>
+                </xsd:complexType>
+              </xsd:element>
+            </xsd:sequence>
+          </xsd:extension>
+        </xsd:complexContent>
+      </xsd:complexType>
+    </xsd:element>
+    <xsd:element name="SharedWithDetails" ma:index="17" nillable="true" ma:displayName="Shared With Details" ma:internalName="SharedWithDetails" ma:readOnly="true">
+      <xsd:simpleType>
+        <xsd:restriction base="dms:Note">
+          <xsd:maxLength value="255"/>
+        </xsd:restriction>
+      </xsd:simpleType>
+    </xsd:element>
+    <xsd:element name="TaxCatchAll" ma:index="23" nillable="true" ma:displayName="Taxonomy Catch All Column" ma:hidden="true" ma:list="{33b292f8-373a-4a4a-b33e-bb3ce9568613}" ma:internalName="TaxCatchAll" ma:showField="CatchAllData" ma:web="ab1e2af6-65fe-48fe-a6ac-2a61b1d19085">
+      <xsd:complexType>
+        <xsd:complexContent>
+          <xsd:extension base="dms:MultiChoiceLookup">
+            <xsd:sequence>
+              <xsd:element name="Value" type="dms:Lookup" maxOccurs="unbounded" minOccurs="0" nillable="true"/>
+            </xsd:sequence>
+          </xsd:extension>
+        </xsd:complexContent>
+      </xsd:complexType>
+    </xsd:element>
+  </xsd:schema>
+  <xsd:schema xmlns="http://schemas.openxmlformats.org/package/2006/metadata/core-properties" xmlns:xsd="http://www.w3.org/2001/XMLSchema" xmlns:xsi="http://www.w3.org/2001/XMLSchema-instance" xmlns:dc="http://purl.org/dc/elements/1.1/" xmlns:dcterms="http://purl.org/dc/terms/" xmlns:odoc="http://schemas.microsoft.com/internal/obd" targetNamespace="http://schemas.openxmlformats.org/package/2006/metadata/core-properties" elementFormDefault="qualified" attributeFormDefault="unqualified" blockDefault="#all">
+    <xsd:import namespace="http://purl.org/dc/elements/1.1/" schemaLocation="http://dublincore.org/schemas/xmls/qdc/2003/04/02/dc.xsd"/>
+    <xsd:import namespace="http://purl.org/dc/terms/" schemaLocation="http://dublincore.org/schemas/xmls/qdc/2003/04/02/dcterms.xsd"/>
+    <xsd:element name="coreProperties" type="CT_coreProperties"/>
+    <xsd:complexType name="CT_coreProperties">
+      <xsd:all>
+        <xsd:element ref="dc:creator" minOccurs="0" maxOccurs="1"/>
+        <xsd:element ref="dcterms:created" minOccurs="0" maxOccurs="1"/>
+        <xsd:element ref="dc:identifier" minOccurs="0" maxOccurs="1"/>
+        <xsd:element name="contentType" minOccurs="0" maxOccurs="1" type="xsd:string" ma:index="0" ma:displayName="Content Type"/>
+        <xsd:element ref="dc:title" minOccurs="0" maxOccurs="1" ma:index="4" ma:displayName="Title"/>
+        <xsd:element ref="dc:subject" minOccurs="0" maxOccurs="1"/>
+        <xsd:element ref="dc:description" minOccurs="0" maxOccurs="1"/>
+        <xsd:element name="keywords" minOccurs="0" maxOccurs="1" type="xsd:string"/>
+        <xsd:element ref="dc:language" minOccurs="0" maxOccurs="1"/>
+        <xsd:element name="category" minOccurs="0" maxOccurs="1" type="xsd:string"/>
+        <xsd:element name="version" minOccurs="0" maxOccurs="1" type="xsd:string"/>
+        <xsd:element name="revision" minOccurs="0" maxOccurs="1" type="xsd:string">
+          <xsd:annotation>
+            <xsd:documentation>
+                        This value indicates the number of saves or revisions. The application is responsible for updating this value after each revision.
+                    </xsd:documentation>
+          </xsd:annotation>
+        </xsd:element>
+        <xsd:element name="lastModifiedBy" minOccurs="0" maxOccurs="1" type="xsd:string"/>
+        <xsd:element ref="dcterms:modified" minOccurs="0" maxOccurs="1"/>
+        <xsd:element name="contentStatus" minOccurs="0" maxOccurs="1" type="xsd:string"/>
+      </xsd:all>
+    </xsd:complexType>
+  </xsd:schema>
+  <xs:schema xmlns:pc="http://schemas.microsoft.com/office/infopath/2007/PartnerControls" xmlns:xs="http://www.w3.org/2001/XMLSchema" targetNamespace="http://schemas.microsoft.com/office/infopath/2007/PartnerControls" elementFormDefault="qualified" attributeFormDefault="unqualified">
+    <xs:element name="Person">
+      <xs:complexType>
+        <xs:sequence>
+          <xs:element ref="pc:DisplayName" minOccurs="0"/>
+          <xs:element ref="pc:AccountId" minOccurs="0"/>
+          <xs:element ref="pc:AccountType" minOccurs="0"/>
+        </xs:sequence>
+      </xs:complexType>
+    </xs:element>
+    <xs:element name="DisplayName" type="xs:string"/>
+    <xs:element name="AccountId" type="xs:string"/>
+    <xs:element name="AccountType" type="xs:string"/>
+    <xs:element name="BDCAssociatedEntity">
+      <xs:complexType>
+        <xs:sequence>
+          <xs:element ref="pc:BDCEntity" minOccurs="0" maxOccurs="unbounded"/>
+        </xs:sequence>
+        <xs:attribute ref="pc:EntityNamespace"/>
+        <xs:attribute ref="pc:EntityName"/>
+        <xs:attribute ref="pc:SystemInstanceName"/>
+        <xs:attribute ref="pc:AssociationName"/>
+      </xs:complexType>
+    </xs:element>
+    <xs:attribute name="EntityNamespace" type="xs:string"/>
+    <xs:attribute name="EntityName" type="xs:string"/>
+    <xs:attribute name="SystemInstanceName" type="xs:string"/>
+    <xs:attribute name="AssociationName" type="xs:string"/>
+    <xs:element name="BDCEntity">
+      <xs:complexType>
+        <xs:sequence>
+          <xs:element ref="pc:EntityDisplayName" minOccurs="0"/>
+          <xs:element ref="pc:EntityInstanceReference" minOccurs="0"/>
+          <xs:element ref="pc:EntityId1" minOccurs="0"/>
+          <xs:element ref="pc:EntityId2" minOccurs="0"/>
+          <xs:element ref="pc:EntityId3" minOccurs="0"/>
+          <xs:element ref="pc:EntityId4" minOccurs="0"/>
+          <xs:element ref="pc:EntityId5" minOccurs="0"/>
+        </xs:sequence>
+      </xs:complexType>
+    </xs:element>
+    <xs:element name="EntityDisplayName" type="xs:string"/>
+    <xs:element name="EntityInstanceReference" type="xs:string"/>
+    <xs:element name="EntityId1" type="xs:string"/>
+    <xs:element name="EntityId2" type="xs:string"/>
+    <xs:element name="EntityId3" type="xs:string"/>
+    <xs:element name="EntityId4" type="xs:string"/>
+    <xs:element name="EntityId5" type="xs:string"/>
+    <xs:element name="Terms">
+      <xs:complexType>
+        <xs:sequence>
+          <xs:element ref="pc:TermInfo" minOccurs="0" maxOccurs="unbounded"/>
+        </xs:sequence>
+      </xs:complexType>
+    </xs:element>
+    <xs:element name="TermInfo">
+      <xs:complexType>
+        <xs:sequence>
+          <xs:element ref="pc:TermName" minOccurs="0"/>
+          <xs:element ref="pc:TermId" minOccurs="0"/>
+        </xs:sequence>
+      </xs:complexType>
+    </xs:element>
+    <xs:element name="TermName" type="xs:string"/>
+    <xs:element name="TermId" type="xs:string"/>
+  </xs:schema>
+</ct:contentTypeSchema>
+</file>
+
+<file path=customXml/itemProps1.xml><?xml version="1.0" encoding="utf-8"?>
+<ds:datastoreItem xmlns:ds="http://schemas.openxmlformats.org/officeDocument/2006/customXml" ds:itemID="{11BD7920-811D-426B-A450-64C1E77481AD}">
+  <ds:schemaRefs>
+    <ds:schemaRef ds:uri="http://schemas.microsoft.com/office/2006/metadata/properties"/>
+    <ds:schemaRef ds:uri="http://schemas.microsoft.com/office/infopath/2007/PartnerControls"/>
+    <ds:schemaRef ds:uri="0bf1b813-6d60-456d-8ecd-8495dbc8f9d4"/>
+    <ds:schemaRef ds:uri="ab1e2af6-65fe-48fe-a6ac-2a61b1d19085"/>
+  </ds:schemaRefs>
+</ds:datastoreItem>
+</file>
+
+<file path=customXml/itemProps2.xml><?xml version="1.0" encoding="utf-8"?>
+<ds:datastoreItem xmlns:ds="http://schemas.openxmlformats.org/officeDocument/2006/customXml" ds:itemID="{58B73198-87C1-4BA7-9B63-20D3383C4986}">
+  <ds:schemaRefs>
+    <ds:schemaRef ds:uri="http://schemas.microsoft.com/sharepoint/v3/contenttype/forms"/>
+  </ds:schemaRefs>
+</ds:datastoreItem>
+</file>
+
+<file path=customXml/itemProps3.xml><?xml version="1.0" encoding="utf-8"?>
+<ds:datastoreItem xmlns:ds="http://schemas.openxmlformats.org/officeDocument/2006/customXml" ds:itemID="{A891CAC4-7D85-48FC-A38B-2D5322522298}">
+  <ds:schemaRefs>
+    <ds:schemaRef ds:uri="http://schemas.microsoft.com/office/2006/metadata/contentType"/>
+    <ds:schemaRef ds:uri="http://schemas.microsoft.com/office/2006/metadata/properties/metaAttributes"/>
+    <ds:schemaRef ds:uri="http://www.w3.org/2001/XMLSchema"/>
+    <ds:schemaRef ds:uri="http://schemas.microsoft.com/office/2006/metadata/properties"/>
+    <ds:schemaRef ds:uri="0bf1b813-6d60-456d-8ecd-8495dbc8f9d4"/>
+    <ds:schemaRef ds:uri="ab1e2af6-65fe-48fe-a6ac-2a61b1d19085"/>
+    <ds:schemaRef ds:uri="http://schemas.microsoft.com/office/2006/documentManagement/types"/>
+    <ds:schemaRef ds:uri="http://schemas.microsoft.com/office/infopath/2007/PartnerControls"/>
+    <ds:schemaRef ds:uri="http://schemas.openxmlformats.org/package/2006/metadata/core-properties"/>
+    <ds:schemaRef ds:uri="http://purl.org/dc/elements/1.1/"/>
+    <ds:schemaRef ds:uri="http://purl.org/dc/terms/"/>
+    <ds:schemaRef ds:uri="http://schemas.microsoft.com/internal/obd"/>
+  </ds:schemaRefs>
+</ds:datastoreItem>
 </file>
</xml_diff>